<commit_message>
Update messaging playbook: refine problem statements, enhance clarity, and improve engagement strategies
</commit_message>
<xml_diff>
--- a/microfrontend/upstander_international/artifacts/p3b_First_Video_Script_UpstanderInternational.docx
+++ b/microfrontend/upstander_international/artifacts/p3b_First_Video_Script_UpstanderInternational.docx
@@ -108,7 +108,7 @@
                 <w:i w:val="0"/>
                 <w:sz w:val="20"/>
               </w:rPr>
-              <w:t>PASS — 4 problems, each traced to upstanderonline.com (live site review) or the Upwork job posting</w:t>
+              <w:t>PASS — 4 problems, all traced to upstanderonline.com and all checkable by the prospect himself. Beat 2 explicitly invites him to reproduce the strongest one on his own site.</w:t>
             </w:r>
           </w:p>
         </w:tc>
@@ -276,7 +276,7 @@
                 <w:i w:val="0"/>
                 <w:sz w:val="20"/>
               </w:rPr>
-              <w:t>PASS — 342 words, ~2.9 min at 120 wpm</w:t>
+              <w:t>PASS — 359 words, ~3.0 min at 120 wpm</w:t>
             </w:r>
           </w:p>
         </w:tc>
@@ -712,7 +712,7 @@
           <w:i w:val="0"/>
           <w:sz w:val="20"/>
         </w:rPr>
-        <w:t>channel, and sixteen students are enrolled in your course. I</w:t>
+        <w:t>channel. Sixteen are enrolled in your course, and after an hour</w:t>
       </w:r>
       <w:r>
         <w:br/>
@@ -724,7 +724,7 @@
           <w:i w:val="0"/>
           <w:sz w:val="20"/>
         </w:rPr>
-        <w:t>spent time on your live site to find out why, and the answer is</w:t>
+        <w:t>on your site the reason is clear: anyone who tries to buy that</w:t>
       </w:r>
       <w:r>
         <w:br/>
@@ -736,7 +736,7 @@
           <w:i w:val="0"/>
           <w:sz w:val="20"/>
         </w:rPr>
-        <w:t>that your checkout doesn't work.</w:t>
+        <w:t>course lands on a page that doesn't exist.</w:t>
       </w:r>
       <w:r>
         <w:br/>
@@ -771,7 +771,7 @@
           <w:i w:val="0"/>
           <w:sz w:val="20"/>
         </w:rPr>
-        <w:t>Here is what anyone who looked closely would see. Add R.E.A.Ch!</w:t>
+        <w:t>Here's what anyone who looked would see. Someone finishes one of</w:t>
       </w:r>
       <w:r>
         <w:br/>
@@ -783,7 +783,7 @@
           <w:i w:val="0"/>
           <w:sz w:val="20"/>
         </w:rPr>
-        <w:t>to the cart, and the page you land on returns a 404 — the page</w:t>
+        <w:t>your videos and wants more. No email capture anywhere — fifty</w:t>
       </w:r>
       <w:r>
         <w:br/>
@@ -795,7 +795,7 @@
           <w:i w:val="0"/>
           <w:sz w:val="20"/>
         </w:rPr>
-        <w:t>can't be found. I went through fifty pages of your site, and</w:t>
+        <w:t>pages, not one opt-in form. Say they find the course anyway. No</w:t>
       </w:r>
       <w:r>
         <w:br/>
@@ -807,7 +807,7 @@
           <w:i w:val="0"/>
           <w:sz w:val="20"/>
         </w:rPr>
-        <w:t>there is not one email opt-in form on any of them. Your course</w:t>
+        <w:t>modules, no preview, no reason to hand over $199. Say they buy</w:t>
       </w:r>
       <w:r>
         <w:br/>
@@ -819,7 +819,7 @@
           <w:i w:val="0"/>
           <w:sz w:val="20"/>
         </w:rPr>
-        <w:t>pages show no modules, no preview, no reason to hand over $199.</w:t>
+        <w:t>it regardless: add R.E.A.Ch! to the cart, and the page you land</w:t>
       </w:r>
       <w:r>
         <w:br/>
@@ -831,7 +831,7 @@
           <w:i w:val="0"/>
           <w:sz w:val="20"/>
         </w:rPr>
-        <w:t>And your contact page has no inquiry form at all, so an event</w:t>
+        <w:t>on returns a 404. Don't take my word for it — try it on your own</w:t>
       </w:r>
       <w:r>
         <w:br/>
@@ -843,7 +843,7 @@
           <w:i w:val="0"/>
           <w:sz w:val="20"/>
         </w:rPr>
-        <w:t>planner who wants to book you has nowhere to do it. None of that</w:t>
+        <w:t>site. And if they try to book you to speak instead, your contact</w:t>
       </w:r>
       <w:r>
         <w:br/>
@@ -855,7 +855,7 @@
           <w:i w:val="0"/>
           <w:sz w:val="20"/>
         </w:rPr>
-        <w:t>is a guess. It is all on the public site.</w:t>
+        <w:t>page has no form. Four ways in. All four closed.</w:t>
       </w:r>
       <w:r>
         <w:br/>
@@ -890,7 +890,7 @@
           <w:i w:val="0"/>
           <w:sz w:val="20"/>
         </w:rPr>
-        <w:t>Here is where my read stops. I can see the broken checkout, the</w:t>
+        <w:t>Here's where my read stops. I can see the broken checkout, the</w:t>
       </w:r>
       <w:r>
         <w:br/>
@@ -902,7 +902,7 @@
           <w:i w:val="0"/>
           <w:sz w:val="20"/>
         </w:rPr>
-        <w:t>missing forms, the empty course pages. What I cannot see is</w:t>
+        <w:t>missing forms, the empty course pages. I can't see whether you</w:t>
       </w:r>
       <w:r>
         <w:br/>
@@ -914,7 +914,7 @@
           <w:i w:val="0"/>
           <w:sz w:val="20"/>
         </w:rPr>
-        <w:t>whether you have an email list anywhere, or how large it is. I</w:t>
+        <w:t>have an email list. I can't see where your video descriptions</w:t>
       </w:r>
       <w:r>
         <w:br/>
@@ -926,7 +926,7 @@
           <w:i w:val="0"/>
           <w:sz w:val="20"/>
         </w:rPr>
-        <w:t>cannot see whether your video descriptions link to a course at</w:t>
+        <w:t>send people — and either way, the diagnosis holds. If they don't</w:t>
       </w:r>
       <w:r>
         <w:br/>
@@ -938,7 +938,7 @@
           <w:i w:val="0"/>
           <w:sz w:val="20"/>
         </w:rPr>
-        <w:t>all today. And I cannot see how many times this year you have</w:t>
+        <w:t>link to the course, that's the leak. If they do, they point at</w:t>
       </w:r>
       <w:r>
         <w:br/>
@@ -950,7 +950,7 @@
           <w:i w:val="0"/>
           <w:sz w:val="20"/>
         </w:rPr>
-        <w:t>had to hire someone just to make the site work again. Those</w:t>
+        <w:t>that 404. And I can't see how often you've paid someone this</w:t>
       </w:r>
       <w:r>
         <w:br/>
@@ -962,7 +962,7 @@
           <w:i w:val="0"/>
           <w:sz w:val="20"/>
         </w:rPr>
-        <w:t>three answers are where the real money is, and they are the</w:t>
+        <w:t>year to make the site work again. Those are the first things I'd</w:t>
       </w:r>
       <w:r>
         <w:br/>
@@ -974,7 +974,7 @@
           <w:i w:val="0"/>
           <w:sz w:val="20"/>
         </w:rPr>
-        <w:t>first things I would want to map with you.</w:t>
+        <w:t>map with you, and where the real money is.</w:t>
       </w:r>
       <w:r>
         <w:br/>
@@ -1021,7 +1021,7 @@
           <w:i w:val="0"/>
           <w:sz w:val="20"/>
         </w:rPr>
-        <w:t>have bought the course. Even at one percent — the industry floor</w:t>
+        <w:t>bought the course. Six hundredths of one percent. Even at one</w:t>
       </w:r>
       <w:r>
         <w:br/>
@@ -1033,7 +1033,7 @@
           <w:i w:val="0"/>
           <w:sz w:val="20"/>
         </w:rPr>
-        <w:t>for a solo educator, not a number from your business — that same</w:t>
+        <w:t>percent — the industry floor for a solo educator, not a number</w:t>
       </w:r>
       <w:r>
         <w:br/>
@@ -1045,7 +1045,7 @@
           <w:i w:val="0"/>
           <w:sz w:val="20"/>
         </w:rPr>
-        <w:t>subscriber base is worth roughly $49,750 in course revenue. You</w:t>
+        <w:t>from your business — that base is worth roughly $49,750 in</w:t>
       </w:r>
       <w:r>
         <w:br/>
@@ -1057,7 +1057,7 @@
           <w:i w:val="0"/>
           <w:sz w:val="20"/>
         </w:rPr>
-        <w:t>have collected $3,184. Three books are coming in 2026, onto a</w:t>
+        <w:t>course revenue. You've collected $3,184. Tomorrow you'll publish</w:t>
       </w:r>
       <w:r>
         <w:br/>
@@ -1069,7 +1069,7 @@
           <w:i w:val="0"/>
           <w:sz w:val="20"/>
         </w:rPr>
-        <w:t>channel that posts daily. This gap does not shrink as you grow.</w:t>
+        <w:t>again: two thousand more people hearing you, with nowhere</w:t>
       </w:r>
       <w:r>
         <w:br/>
@@ -1081,7 +1081,19 @@
           <w:i w:val="0"/>
           <w:sz w:val="20"/>
         </w:rPr>
-        <w:t>It compounds every day.</w:t>
+        <w:t>working to send them. Three books are coming in 2026, and this</w:t>
+      </w:r>
+      <w:r>
+        <w:br/>
+      </w:r>
+      <w:r>
+        <w:rPr>
+          <w:rFonts w:ascii="Courier New" w:hAnsi="Courier New" w:eastAsia="Courier New"/>
+          <w:b w:val="0"/>
+          <w:i w:val="0"/>
+          <w:sz w:val="20"/>
+        </w:rPr>
+        <w:t>gap doesn't shrink as you grow. It compounds every day you post.</w:t>
       </w:r>
       <w:r>
         <w:br/>
@@ -1116,7 +1128,7 @@
           <w:i w:val="0"/>
           <w:sz w:val="20"/>
         </w:rPr>
-        <w:t>This is the kind of operational problem we build systems to</w:t>
+        <w:t>You've built the audience; the infrastructure hasn't caught up.</w:t>
       </w:r>
       <w:r>
         <w:br/>
@@ -1128,7 +1140,7 @@
           <w:i w:val="0"/>
           <w:sz w:val="20"/>
         </w:rPr>
-        <w:t>close. You know the inside of this. I only see the outside.</w:t>
+        <w:t>That's the kind of operational problem we build systems to</w:t>
       </w:r>
       <w:r>
         <w:br/>
@@ -1140,7 +1152,7 @@
           <w:i w:val="0"/>
           <w:sz w:val="20"/>
         </w:rPr>
-        <w:t>Whichever of these you push back on tells me what actually</w:t>
+        <w:t>close. You know the inside of this — I only see the outside.</w:t>
       </w:r>
       <w:r>
         <w:br/>
@@ -1152,7 +1164,19 @@
           <w:i w:val="0"/>
           <w:sz w:val="20"/>
         </w:rPr>
-        <w:t>matters most — reply with the one I got wrong.</w:t>
+        <w:t>Whichever of these you push back on tells me what matters most.</w:t>
+      </w:r>
+      <w:r>
+        <w:br/>
+      </w:r>
+      <w:r>
+        <w:rPr>
+          <w:rFonts w:ascii="Courier New" w:hAnsi="Courier New" w:eastAsia="Courier New"/>
+          <w:b w:val="0"/>
+          <w:i w:val="0"/>
+          <w:sz w:val="20"/>
+        </w:rPr>
+        <w:t>Reply with the one I got wrong.</w:t>
       </w:r>
     </w:p>
     <w:p>
@@ -1393,7 +1417,7 @@
                 <w:i w:val="0"/>
                 <w:sz w:val="20"/>
               </w:rPr>
-              <w:t>280–360 spoken words at a calm ~120 wpm. This script: 342.</w:t>
+              <w:t>280–360 spoken words at a calm ~120 wpm. This script: 359.</w:t>
             </w:r>
           </w:p>
         </w:tc>
@@ -1535,7 +1559,7 @@
           <w:i w:val="0"/>
           <w:sz w:val="22"/>
         </w:rPr>
-        <w:t>"Twenty-five thousand people are subscribed to your YouTube channel, and sixteen students are enrolled in your course. I spent time on your live site to find out why, and the answer is that your checkout doesn't work."</w:t>
+        <w:t>"Twenty-five thousand people are subscribed to your YouTube channel. Sixteen are enrolled in your course, and after an hour on your site the reason is clear: anyone who tries to buy that course lands on a page that doesn't exist."</w:t>
       </w:r>
     </w:p>
     <w:p>
@@ -1560,7 +1584,7 @@
           <w:i/>
           <w:sz w:val="22"/>
         </w:rPr>
-        <w:t>No intro. No "Hi, I'm Abdul." The who-and-why context lives in the wrapper DM, not here, so the open stays a pure problem-first hook. Two sentences, 37 words. The two numbers do the work — do not explain them. Let the silence after "doesn't work" sit for a full beat before Beat 2.</w:t>
+        <w:t>No intro. No "Hi, I'm Abdul." The who-and-why context lives in the wrapper DM, so the open stays a pure problem-first hook. Two sentences, 40 words. The two numbers do the work — do not explain them. Note the causal claim is stated in ONE direction only: the shortfall is the checkout, not the audience. That ordering is deliberate — Decision Card §10 names criticism of his own effort as the primary defensiveness trigger, and the first sentence he hears must clear him of blame. Let the silence after "doesn't exist" sit a full beat before Beat 2.</w:t>
       </w:r>
     </w:p>
     <w:p>
@@ -1632,7 +1656,7 @@
           <w:i w:val="0"/>
           <w:sz w:val="22"/>
         </w:rPr>
-        <w:t>Zoom into the Current Problem Register table. Advance ONE row at a time — never show the full table at once. Each problem gets its own screen moment, timed to the sentence naming it.</w:t>
+        <w:t>Zoom into the Current Problem Register table. Advance ONE row at a time, in the order the subscriber hits them — never show the full table at once. Each dead end gets its own screen moment, landing exactly on the sentence that names it.</w:t>
       </w:r>
     </w:p>
     <w:p>
@@ -1657,7 +1681,7 @@
           <w:i w:val="0"/>
           <w:sz w:val="22"/>
         </w:rPr>
-        <w:t>Problem table, rows 1, 2, 3 and 5 in sequence: checkout 404 → no email capture → course content invisible → no speaker inquiry path.</w:t>
+        <w:t>Problem table in JOURNEY order, not table order: row 2 (no email capture) → row 3 (course content invisible) → row 1 (checkout 404) → row 5 (no speaker inquiry path).</w:t>
       </w:r>
     </w:p>
     <w:p>
@@ -1682,7 +1706,7 @@
           <w:i w:val="0"/>
           <w:sz w:val="22"/>
         </w:rPr>
-        <w:t>"Here is what anyone who looked closely would see. Add R.E.A.Ch! to the cart, and the page you land on returns a 404 — the page can't be found. I went through fifty pages of your site, and there is not one email opt-in form on any of them. Your course pages show no modules, no preview, no reason to hand over $199. And your contact page has no inquiry form at all, so an event planner who wants to book you has nowhere to do it. None of that is a guess. It is all on the public site."</w:t>
+        <w:t>"Here's what anyone who looked would see. Someone finishes one of your videos and wants more. No email capture anywhere — fifty pages, not one opt-in form. Say they find the course anyway. No modules, no preview, no reason to hand over $199. Say they buy it regardless: add R.E.A.Ch! to the cart, and the page you land on returns a 404. Don't take my word for it — try it on your own site. And if they try to book you to speak instead, your contact page has no form. Four ways in. All four closed."</w:t>
       </w:r>
     </w:p>
     <w:p>
@@ -1707,7 +1731,57 @@
           <w:i/>
           <w:sz w:val="22"/>
         </w:rPr>
-        <w:t>Sources cited by name, all public: the live site for the 404, the 50-page review for the missing opt-in forms, the course pages, the contact page. Frame as diligence — "anyone who looked closely" — never as surveillance of internal systems. 99 words. Deliberately excluded: the MailPoet pages (they render blank by design and prove nothing) and the $19,900 Upwork figure (lifetime spend across 19 jobs, not this site — attributing it here is both wrong and the fastest way to trigger defensiveness).</w:t>
+        <w:t>STRUCTURE: this beat is a single person's journey, not a list of four findings. One subscriber finishes a video and tries, four separate ways, to give him money — and every door is shut. Four facts get checked; one person walking into four closed doors gets felt. The four problems are reordered out of table order into the order a real visitor meets them, and the beat closes on the count: "Four ways in. All four closed."</w:t>
+      </w:r>
+    </w:p>
+    <w:p>
+      <w:pPr>
+        <w:spacing w:after="80"/>
+        <w:shd w:val="clear" w:color="auto" w:fill="FFF3CC"/>
+      </w:pPr>
+      <w:r>
+        <w:rPr>
+          <w:rFonts w:ascii="Arial" w:hAnsi="Arial" w:eastAsia="Arial"/>
+          <w:b/>
+          <w:i w:val="0"/>
+          <w:color w:val="1A3A5C"/>
+          <w:sz w:val="22"/>
+        </w:rPr>
+        <w:t xml:space="preserve">📌 NOTE  </w:t>
+      </w:r>
+      <w:r>
+        <w:rPr>
+          <w:rFonts w:ascii="Arial" w:hAnsi="Arial" w:eastAsia="Arial"/>
+          <w:b w:val="0"/>
+          <w:i/>
+          <w:sz w:val="22"/>
+        </w:rPr>
+        <w:t>THE VERIFICATION CHALLENGE — do not cut this line. "Don't take my word for it — try it on your own site" is the highest-leverage sentence in the video. It costs him twenty seconds, it is the one claim he can check without leaving his desk, and the moment the 404 renders for him personally, every other statement in this video inherits that credibility. It also converts a passive watcher into someone who has already taken an action about the problem. Only make this offer on the R.E.A.Ch! 404 — it is the single claim verified as a literal 404 (p1a p.37). Never invite him to test L.E.A.D.</w:t>
+      </w:r>
+    </w:p>
+    <w:p>
+      <w:pPr>
+        <w:spacing w:after="80"/>
+        <w:shd w:val="clear" w:color="auto" w:fill="FFF3CC"/>
+      </w:pPr>
+      <w:r>
+        <w:rPr>
+          <w:rFonts w:ascii="Arial" w:hAnsi="Arial" w:eastAsia="Arial"/>
+          <w:b/>
+          <w:i w:val="0"/>
+          <w:color w:val="1A3A5C"/>
+          <w:sz w:val="22"/>
+        </w:rPr>
+        <w:t xml:space="preserve">📌 NOTE  </w:t>
+      </w:r>
+      <w:r>
+        <w:rPr>
+          <w:rFonts w:ascii="Arial" w:hAnsi="Arial" w:eastAsia="Arial"/>
+          <w:b w:val="0"/>
+          <w:i/>
+          <w:sz w:val="22"/>
+        </w:rPr>
+        <w:t>Sources cited by name, all public: the 50-page review for the missing opt-in forms, the course pages, the live cart, the contact page. Frame as diligence — "anyone who looked" — never as surveillance of internal systems. Deliberately excluded: the MailPoet pages (they render blank by design and prove nothing) and the $19,900 Upwork figure (lifetime spend across 19 jobs, not this site — attributing it here is both wrong and the fastest way to trigger defensiveness).</w:t>
       </w:r>
     </w:p>
     <w:p>
@@ -1829,7 +1903,7 @@
           <w:i w:val="0"/>
           <w:sz w:val="22"/>
         </w:rPr>
-        <w:t>"Here is where my read stops. I can see the broken checkout, the missing forms, the empty course pages. What I cannot see is whether you have an email list anywhere, or how large it is. I cannot see whether your video descriptions link to a course at all today. And I cannot see how many times this year you have had to hire someone just to make the site work again. Those three answers are where the real money is, and they are the first things I would want to map with you."</w:t>
+        <w:t>"Here's where my read stops. I can see the broken checkout, the missing forms, the empty course pages. I can't see whether you have an email list. I can't see where your video descriptions send people — and either way, the diagnosis holds. If they don't link to the course, that's the leak. If they do, they point at that 404. And I can't see how often you've paid someone this year to make the site work again. Those are the first things I'd map with you, and where the real money is."</w:t>
       </w:r>
     </w:p>
     <w:p>
@@ -1854,7 +1928,32 @@
           <w:i/>
           <w:sz w:val="22"/>
         </w:rPr>
-        <w:t>DECOUPLING GUARD — read this before changing a word of Beat 3 or Beat 4. The three unknowns confessed here are: (1) email list size, (2) whether video descriptions link anywhere, (3) freelancer re-hire frequency. Beat 4's stakes number uses NONE of them — it is built from 25,000 subscribers × $199 at a declared 1% floor. Do not add "I can't see your conversion rate" to this beat: Beat 4 openly assumes a conversion rate, and confessing it here would let a sharp CEO catch "you said you can't see it, then priced my loss on it." That contradiction is the exact failure this beat exists to avoid. Authority here comes from method rigor, never from pretending to know internal numbers.</w:t>
+        <w:t>THE LOCK — the strongest single move in this video. The obvious hole in the whole diagnosis is "maybe his videos never link to the course anyway." Rather than hide that, this beat names it and then closes it: if the descriptions don't link to the course, that IS the leak; if they do, they point at a 404. Both branches land on the same conclusion, so the unknown cannot be used to escape the diagnosis. Delivered as a confession, it reads as honesty; structurally it is the tightest proof in the script. Deliver it evenly — no triumph in the voice. If it sounds like a trap springing, it stops working.</w:t>
+      </w:r>
+    </w:p>
+    <w:p>
+      <w:pPr>
+        <w:spacing w:after="80"/>
+        <w:shd w:val="clear" w:color="auto" w:fill="FFF3CC"/>
+      </w:pPr>
+      <w:r>
+        <w:rPr>
+          <w:rFonts w:ascii="Arial" w:hAnsi="Arial" w:eastAsia="Arial"/>
+          <w:b/>
+          <w:i w:val="0"/>
+          <w:color w:val="1A3A5C"/>
+          <w:sz w:val="22"/>
+        </w:rPr>
+        <w:t xml:space="preserve">📌 NOTE  </w:t>
+      </w:r>
+      <w:r>
+        <w:rPr>
+          <w:rFonts w:ascii="Arial" w:hAnsi="Arial" w:eastAsia="Arial"/>
+          <w:b w:val="0"/>
+          <w:i/>
+          <w:sz w:val="22"/>
+        </w:rPr>
+        <w:t>DECOUPLING GUARD — read before changing a word of Beat 3 or Beat 4. The three unknowns confessed here are: (1) email list existence and size, (2) where video descriptions send people, (3) freelancer re-hire frequency. Beat 4's stakes number uses NONE of them — it is built from 25,000 subscribers × $199 at a declared 1% floor. Do not add "I can't see your conversion rate" to this beat: Beat 4 openly assumes a conversion rate, and confessing it here would let a sharp CEO catch "you said you can't see it, then priced my loss on it." That contradiction is the exact failure this beat exists to prevent. Note the Lock survives the guard: it resolves an unknown into a conclusion, but contributes no input to the stakes arithmetic. Authority comes from method rigor, never from pretending to know internal numbers.</w:t>
       </w:r>
     </w:p>
     <w:p>
@@ -1976,7 +2075,7 @@
           <w:i w:val="0"/>
           <w:sz w:val="22"/>
         </w:rPr>
-        <w:t>"Twenty-five thousand people chose to subscribe to you. Sixteen have bought the course. Even at one percent — the industry floor for a solo educator, not a number from your business — that same subscriber base is worth roughly $49,750 in course revenue. You have collected $3,184. Three books are coming in 2026, onto a channel that posts daily. This gap does not shrink as you grow. It compounds every day."</w:t>
+        <w:t>"Twenty-five thousand people chose to subscribe to you. Sixteen bought the course. Six hundredths of one percent. Even at one percent — the industry floor for a solo educator, not a number from your business — that base is worth roughly $49,750 in course revenue. You've collected $3,184. Tomorrow you'll publish again: two thousand more people hearing you, with nowhere working to send them. Three books are coming in 2026, and this gap doesn't shrink as you grow. It compounds every day you post."</w:t>
       </w:r>
     </w:p>
     <w:p>
@@ -2001,7 +2100,57 @@
           <w:i/>
           <w:sz w:val="22"/>
         </w:rPr>
-        <w:t>THE ONE STAKES NUMBER: ~$49,750 [Estimated]. Construction: 25,000 subscribers (L1, directly observable on the channel, verified 2026-07-09) × 1% × $199 course price (L1, published). Against $3,184 collected (16 × $199, both L1). The 1% is spoken aloud as "the industry floor for a solo educator, not a number from your business" — the L3 proxy is disclosed as a benchmark in the same breath, never smuggled in. Every input is either L1 or an openly declared assumption. REGRET GAP: the three 2026 books are Dr. Dibinga's own publicly stated plan (p1c Post 17). Pressure the GOAL, never the character — no guilt, no shame. The compounding line is the whole point: the speaking calendar resets annually, the channel does not. 69 words — Beat 4 stays light because the proof-of-competence line moved to Beat 5.</w:t>
+        <w:t>THE ONE STAKES NUMBER: ~$49,750 [Estimated]. Construction: 25,000 subscribers (L1, directly observable on the channel, verified 2026-07-09) × 1% × $199 course price (L1, published). Against $3,184 collected (16 × $199, both L1). The 1% is spoken aloud as "the industry floor for a solo educator, not a number from your business" — the L3 proxy is disclosed as a benchmark in the same breath, never smuggled in. Only ONE stakes number is permitted; $3,184 and 0.064% are not estimates, they are L1 arithmetic on published figures.</w:t>
+      </w:r>
+    </w:p>
+    <w:p>
+      <w:pPr>
+        <w:spacing w:after="80"/>
+        <w:shd w:val="clear" w:color="auto" w:fill="FFF3CC"/>
+      </w:pPr>
+      <w:r>
+        <w:rPr>
+          <w:rFonts w:ascii="Arial" w:hAnsi="Arial" w:eastAsia="Arial"/>
+          <w:b/>
+          <w:i w:val="0"/>
+          <w:color w:val="1A3A5C"/>
+          <w:sz w:val="22"/>
+        </w:rPr>
+        <w:t xml:space="preserve">📌 NOTE  </w:t>
+      </w:r>
+      <w:r>
+        <w:rPr>
+          <w:rFonts w:ascii="Arial" w:hAnsi="Arial" w:eastAsia="Arial"/>
+          <w:b w:val="0"/>
+          <w:i/>
+          <w:sz w:val="22"/>
+        </w:rPr>
+        <w:t>"SIX HUNDREDTHS OF ONE PERCENT" (16 ÷ 25,000 = 0.064%) — say it as its own sentence, then stop. Do not round it to "less than a tenth of a percent": the specificity is the point, and the listener must not have to do the division himself. This is the line that makes the gap physical.</w:t>
+      </w:r>
+    </w:p>
+    <w:p>
+      <w:pPr>
+        <w:spacing w:after="80"/>
+        <w:shd w:val="clear" w:color="auto" w:fill="FFF3CC"/>
+      </w:pPr>
+      <w:r>
+        <w:rPr>
+          <w:rFonts w:ascii="Arial" w:hAnsi="Arial" w:eastAsia="Arial"/>
+          <w:b/>
+          <w:i w:val="0"/>
+          <w:color w:val="1A3A5C"/>
+          <w:sz w:val="22"/>
+        </w:rPr>
+        <w:t xml:space="preserve">📌 NOTE  </w:t>
+      </w:r>
+      <w:r>
+        <w:rPr>
+          <w:rFonts w:ascii="Arial" w:hAnsi="Arial" w:eastAsia="Arial"/>
+          <w:b w:val="0"/>
+          <w:i/>
+          <w:sz w:val="22"/>
+        </w:rPr>
+        <w:t>COMPOUNDING, MADE PRESENT-TENSE: "Tomorrow you'll publish again" converts an abstract trend into an appointment he already has. The speaking calendar resets once a year; the channel does not. Note the careful phrasing — "two thousand more people hearing you, with nowhere working to send them" claims only that no working destination exists, never that all viewers visit the site. That restraint is what keeps the sentence true and consistent with the Lock in Beat 3. REGRET GAP: the three 2026 books are Dr. Dibinga's own publicly stated plan (p1c Post 17). Pressure the GOAL, never the character — no guilt, no shame. Beat 4 stays under budget because the proof-of-competence line lives in Beat 5.</w:t>
       </w:r>
     </w:p>
     <w:p>
@@ -2123,7 +2272,7 @@
           <w:i w:val="0"/>
           <w:sz w:val="22"/>
         </w:rPr>
-        <w:t>"This is the kind of operational problem we build systems to close. You know the inside of this. I only see the outside. Whichever of these you push back on tells me what actually matters most — reply with the one I got wrong."</w:t>
+        <w:t>"You've built the audience; the infrastructure hasn't caught up. That's the kind of operational problem we build systems to close. You know the inside of this — I only see the outside. Whichever of these you push back on tells me what matters most. Reply with the one I got wrong."</w:t>
       </w:r>
     </w:p>
     <w:p>
@@ -2148,7 +2297,32 @@
           <w:i/>
           <w:sz w:val="22"/>
         </w:rPr>
-        <w:t>PROOF OF COMPETENCE: "This is the kind of operational problem we build systems to close" — opens Beat 5, keeping Beat 4 from overloading. It is a capability statement from real Dev8X context, never a fabricated client or result. REPLY ASK: framed as his benefit — he sets the record straight about his own business. Control over that record is the motivator, not a favour to us. HIGH confidence, so the ask is direct: "reply with the one I got wrong." No "I'd love to hear from you." No calendar link. No price. The consultation is never mentioned in this video.</w:t>
+        <w:t>THE REFRAME — "You've built the audience; the infrastructure hasn't caught up." This is the mandated framing from Decision Card §10, and it is the last thing he hears before the ask. Everything before it has been a catalogue of what is broken; this line places every one of those failures on the infrastructure and none on him. Without it, a proud founder who has spent real money on this site hears three minutes of criticism. With it, he hears that the hard part is already done. Do not cut it to save words.</w:t>
+      </w:r>
+    </w:p>
+    <w:p>
+      <w:pPr>
+        <w:spacing w:after="80"/>
+        <w:shd w:val="clear" w:color="auto" w:fill="FFF3CC"/>
+      </w:pPr>
+      <w:r>
+        <w:rPr>
+          <w:rFonts w:ascii="Arial" w:hAnsi="Arial" w:eastAsia="Arial"/>
+          <w:b/>
+          <w:i w:val="0"/>
+          <w:color w:val="1A3A5C"/>
+          <w:sz w:val="22"/>
+        </w:rPr>
+        <w:t xml:space="preserve">📌 NOTE  </w:t>
+      </w:r>
+      <w:r>
+        <w:rPr>
+          <w:rFonts w:ascii="Arial" w:hAnsi="Arial" w:eastAsia="Arial"/>
+          <w:b w:val="0"/>
+          <w:i/>
+          <w:sz w:val="22"/>
+        </w:rPr>
+        <w:t>PROOF OF COMPETENCE: "That's the kind of operational problem we build systems to close" — it rides directly on the reframe, keeping Beat 4 from overloading. A capability statement from real Dev8X context, never a fabricated client or result. REPLY ASK: framed as his benefit — he sets the record straight about his own business. Control over that record is the motivator, not a favour to us. HIGH confidence, so the ask is direct: "Reply with the one I got wrong." No "I'd love to hear from you." No calendar link. No price. The consultation is never mentioned in this video.</w:t>
       </w:r>
     </w:p>
     <w:p>
@@ -2279,7 +2453,7 @@
                 <w:i w:val="0"/>
                 <w:sz w:val="20"/>
               </w:rPr>
-              <w:t>37</w:t>
+              <w:t>40</w:t>
             </w:r>
           </w:p>
         </w:tc>
@@ -2341,7 +2515,7 @@
                 <w:i w:val="0"/>
                 <w:sz w:val="20"/>
               </w:rPr>
-              <w:t>99</w:t>
+              <w:t>95</w:t>
             </w:r>
           </w:p>
         </w:tc>
@@ -2403,7 +2577,7 @@
                 <w:i w:val="0"/>
                 <w:sz w:val="20"/>
               </w:rPr>
-              <w:t>94</w:t>
+              <w:t>92</w:t>
             </w:r>
           </w:p>
         </w:tc>
@@ -2465,7 +2639,7 @@
                 <w:i w:val="0"/>
                 <w:sz w:val="20"/>
               </w:rPr>
-              <w:t>69</w:t>
+              <w:t>82</w:t>
             </w:r>
           </w:p>
         </w:tc>
@@ -2527,7 +2701,7 @@
                 <w:i w:val="0"/>
                 <w:sz w:val="20"/>
               </w:rPr>
-              <w:t>43</w:t>
+              <w:t>50</w:t>
             </w:r>
           </w:p>
         </w:tc>
@@ -2547,7 +2721,7 @@
                 <w:i w:val="0"/>
                 <w:sz w:val="20"/>
               </w:rPr>
-              <w:t>2:20 – 2:51</w:t>
+              <w:t>2:20 – 3:00</w:t>
             </w:r>
           </w:p>
         </w:tc>
@@ -2589,7 +2763,7 @@
                 <w:i w:val="0"/>
                 <w:sz w:val="20"/>
               </w:rPr>
-              <w:t>342 words</w:t>
+              <w:t>359 words</w:t>
             </w:r>
           </w:p>
         </w:tc>
@@ -2609,7 +2783,7 @@
                 <w:i w:val="0"/>
                 <w:sz w:val="20"/>
               </w:rPr>
-              <w:t>~2:51 at a calm 120 wpm</w:t>
+              <w:t>~3:00 at a calm 120 wpm</w:t>
             </w:r>
           </w:p>
         </w:tc>
@@ -2626,7 +2800,7 @@
           <w:i/>
           <w:sz w:val="22"/>
         </w:rPr>
-        <w:t>Counted mechanically from the SPEAK blocks above, which are also the source of the caption transcript in §0.2 — the two cannot drift. 342 words sits inside the 280–360 target and the 2–3 minute spec.</w:t>
+        <w:t>Counted mechanically from the SPEAK blocks above, which are also the source of the caption transcript in §0.2 — the two cannot drift. 359 words sits inside the 280–360 target and the 2–3 minute spec.</w:t>
       </w:r>
     </w:p>
     <w:p>
@@ -2671,7 +2845,7 @@
           <w:i w:val="0"/>
           <w:sz w:val="22"/>
         </w:rPr>
-        <w:t>Reply ask is direct: "reply with the one I got wrong." No softening, no "if you have a moment."</w:t>
+        <w:t>Reply ask is direct: "Reply with the one I got wrong." No softening, no "if you have a moment."</w:t>
       </w:r>
     </w:p>
     <w:p>
@@ -2686,7 +2860,7 @@
           <w:i w:val="0"/>
           <w:sz w:val="22"/>
         </w:rPr>
-        <w:t>The broken checkout and the missing opt-in forms are stated without hedge — both are L1 and directly observable by him in under a minute.</w:t>
+        <w:t>The broken checkout and the missing opt-in forms are stated without hedge — both are L1, and Beat 2 hands him the means to check the strongest of them himself. Only a High-confidence script can afford to invite verification; a shaky diagnosis would never survive the prospect testing it live.</w:t>
       </w:r>
     </w:p>
     <w:p>
@@ -2701,7 +2875,7 @@
           <w:i w:val="0"/>
           <w:sz w:val="22"/>
         </w:rPr>
-        <w:t>Beat 3's honesty is sourced from method rigor ("here is exactly what I'd map with you"), never from pretending to know figures we cannot see.</w:t>
+        <w:t>Beat 3's honesty is sourced from method rigor, never from pretending to know figures we cannot see — and the Lock ensures the one unknown a sceptic would reach for cannot be used to dismiss the diagnosis.</w:t>
       </w:r>
     </w:p>
     <w:p>
@@ -2846,7 +3020,7 @@
                 <w:i w:val="0"/>
                 <w:sz w:val="20"/>
               </w:rPr>
-              <w:t>Problems named in Beat 2, in order</w:t>
+              <w:t>The gap, said aloud</w:t>
             </w:r>
           </w:p>
         </w:tc>
@@ -2866,7 +3040,7 @@
                 <w:i w:val="0"/>
                 <w:sz w:val="20"/>
               </w:rPr>
-              <w:t>1. R.E.A.Ch! add-to-cart page returns a 404  ·  2. Not one email opt-in form across 50 pages  ·  3. Course pages show no modules or preview  ·  4. Contact page has no inquiry form</w:t>
+              <w:t>"Six hundredths of one percent." (16 ÷ 25,000)</w:t>
             </w:r>
           </w:p>
         </w:tc>
@@ -2888,7 +3062,7 @@
                 <w:i w:val="0"/>
                 <w:sz w:val="20"/>
               </w:rPr>
-              <w:t>Proof-of-competence line (opens Beat 5)</w:t>
+              <w:t>Problems named in Beat 2, in JOURNEY order</w:t>
             </w:r>
           </w:p>
         </w:tc>
@@ -2908,7 +3082,175 @@
                 <w:i w:val="0"/>
                 <w:sz w:val="20"/>
               </w:rPr>
-              <w:t>"This is the kind of operational problem we build systems to close."</w:t>
+              <w:t>1. No email capture — 50 pages, not one opt-in form  ·  2. Course pages show no modules or preview  ·  3. R.E.A.Ch! add-to-cart page returns a 404  ·  4. Contact page has no inquiry form. Closing line: "Four ways in. All four closed."</w:t>
+            </w:r>
+          </w:p>
+        </w:tc>
+      </w:tr>
+      <w:tr>
+        <w:tc>
+          <w:tcPr>
+            <w:tcW w:type="dxa" w:w="3024"/>
+          </w:tcPr>
+          <w:p>
+            <w:pPr>
+              <w:spacing w:after="40"/>
+            </w:pPr>
+            <w:r/>
+            <w:r>
+              <w:rPr>
+                <w:rFonts w:ascii="Arial" w:hAnsi="Arial" w:eastAsia="Arial"/>
+                <w:b w:val="0"/>
+                <w:i w:val="0"/>
+                <w:sz w:val="20"/>
+              </w:rPr>
+              <w:t>The verification challenge</w:t>
+            </w:r>
+          </w:p>
+        </w:tc>
+        <w:tc>
+          <w:tcPr>
+            <w:tcW w:type="dxa" w:w="6336"/>
+          </w:tcPr>
+          <w:p>
+            <w:pPr>
+              <w:spacing w:after="40"/>
+            </w:pPr>
+            <w:r/>
+            <w:r>
+              <w:rPr>
+                <w:rFonts w:ascii="Arial" w:hAnsi="Arial" w:eastAsia="Arial"/>
+                <w:b w:val="0"/>
+                <w:i w:val="0"/>
+                <w:sz w:val="20"/>
+              </w:rPr>
+              <w:t>"Don't take my word for it — try it on your own site." Applies to the R.E.A.Ch! 404 only.</w:t>
+            </w:r>
+          </w:p>
+        </w:tc>
+      </w:tr>
+      <w:tr>
+        <w:tc>
+          <w:tcPr>
+            <w:tcW w:type="dxa" w:w="3024"/>
+          </w:tcPr>
+          <w:p>
+            <w:pPr>
+              <w:spacing w:after="40"/>
+            </w:pPr>
+            <w:r/>
+            <w:r>
+              <w:rPr>
+                <w:rFonts w:ascii="Arial" w:hAnsi="Arial" w:eastAsia="Arial"/>
+                <w:b w:val="0"/>
+                <w:i w:val="0"/>
+                <w:sz w:val="20"/>
+              </w:rPr>
+              <w:t>The Lock (Beat 3)</w:t>
+            </w:r>
+          </w:p>
+        </w:tc>
+        <w:tc>
+          <w:tcPr>
+            <w:tcW w:type="dxa" w:w="6336"/>
+          </w:tcPr>
+          <w:p>
+            <w:pPr>
+              <w:spacing w:after="40"/>
+            </w:pPr>
+            <w:r/>
+            <w:r>
+              <w:rPr>
+                <w:rFonts w:ascii="Arial" w:hAnsi="Arial" w:eastAsia="Arial"/>
+                <w:b w:val="0"/>
+                <w:i w:val="0"/>
+                <w:sz w:val="20"/>
+              </w:rPr>
+              <w:t>"Either way, the diagnosis holds. If they don't link to the course, that's the leak. If they do, they point at that 404."</w:t>
+            </w:r>
+          </w:p>
+        </w:tc>
+      </w:tr>
+      <w:tr>
+        <w:tc>
+          <w:tcPr>
+            <w:tcW w:type="dxa" w:w="3024"/>
+          </w:tcPr>
+          <w:p>
+            <w:pPr>
+              <w:spacing w:after="40"/>
+            </w:pPr>
+            <w:r/>
+            <w:r>
+              <w:rPr>
+                <w:rFonts w:ascii="Arial" w:hAnsi="Arial" w:eastAsia="Arial"/>
+                <w:b w:val="0"/>
+                <w:i w:val="0"/>
+                <w:sz w:val="20"/>
+              </w:rPr>
+              <w:t>The reframe (opens Beat 5)</w:t>
+            </w:r>
+          </w:p>
+        </w:tc>
+        <w:tc>
+          <w:tcPr>
+            <w:tcW w:type="dxa" w:w="6336"/>
+          </w:tcPr>
+          <w:p>
+            <w:pPr>
+              <w:spacing w:after="40"/>
+            </w:pPr>
+            <w:r/>
+            <w:r>
+              <w:rPr>
+                <w:rFonts w:ascii="Arial" w:hAnsi="Arial" w:eastAsia="Arial"/>
+                <w:b w:val="0"/>
+                <w:i w:val="0"/>
+                <w:sz w:val="20"/>
+              </w:rPr>
+              <w:t>"You've built the audience; the infrastructure hasn't caught up."</w:t>
+            </w:r>
+          </w:p>
+        </w:tc>
+      </w:tr>
+      <w:tr>
+        <w:tc>
+          <w:tcPr>
+            <w:tcW w:type="dxa" w:w="3024"/>
+          </w:tcPr>
+          <w:p>
+            <w:pPr>
+              <w:spacing w:after="40"/>
+            </w:pPr>
+            <w:r/>
+            <w:r>
+              <w:rPr>
+                <w:rFonts w:ascii="Arial" w:hAnsi="Arial" w:eastAsia="Arial"/>
+                <w:b w:val="0"/>
+                <w:i w:val="0"/>
+                <w:sz w:val="20"/>
+              </w:rPr>
+              <w:t>Proof-of-competence line</w:t>
+            </w:r>
+          </w:p>
+        </w:tc>
+        <w:tc>
+          <w:tcPr>
+            <w:tcW w:type="dxa" w:w="6336"/>
+          </w:tcPr>
+          <w:p>
+            <w:pPr>
+              <w:spacing w:after="40"/>
+            </w:pPr>
+            <w:r/>
+            <w:r>
+              <w:rPr>
+                <w:rFonts w:ascii="Arial" w:hAnsi="Arial" w:eastAsia="Arial"/>
+                <w:b w:val="0"/>
+                <w:i w:val="0"/>
+                <w:sz w:val="20"/>
+              </w:rPr>
+              <w:t>"That's the kind of operational problem we build systems to close."</w:t>
             </w:r>
           </w:p>
         </w:tc>
@@ -2950,7 +3292,7 @@
                 <w:i w:val="0"/>
                 <w:sz w:val="20"/>
               </w:rPr>
-              <w:t>"reply with the one I got wrong"</w:t>
+              <w:t>"Reply with the one I got wrong."</w:t>
             </w:r>
           </w:p>
         </w:tc>
@@ -2992,7 +3334,7 @@
                 <w:i w:val="0"/>
                 <w:sz w:val="20"/>
               </w:rPr>
-              <w:t>Email list size unknown  ·  whether video descriptions link to a course unknown  ·  freelancer re-hire frequency unknown</w:t>
+              <w:t>Email list existence and size unknown  ·  where video descriptions send people unknown  ·  freelancer re-hire frequency unknown</w:t>
             </w:r>
           </w:p>
         </w:tc>

</xml_diff>

<commit_message>
Update video script and messaging playbook for clarity and consistency in communication
</commit_message>
<xml_diff>
--- a/microfrontend/upstander_international/artifacts/p3b_First_Video_Script_UpstanderInternational.docx
+++ b/microfrontend/upstander_international/artifacts/p3b_First_Video_Script_UpstanderInternational.docx
@@ -996,7 +996,7 @@
           <w:i w:val="0"/>
           <w:sz w:val="22"/>
         </w:rPr>
-        <w:t>📌 NOTE  If unwatched after 5–7 days, send this second, shorter wrapper — a different angle. Never a third.</w:t>
+        <w:t>📌 NOTE  If unwatched after 5–7 days, send this second, shorter wrapper — a different angle. Never a third. The WRAPPER is shorter; the VIDEO is the same one. An earlier draft said “recorded two minutes on it,” which advertises a second, shorter film that does not exist and makes the first message look like it was describing something else. Always say three minutes, in both wrappers.</w:t>
       </w:r>
     </w:p>
     <w:p>
@@ -1011,7 +1011,7 @@
           <w:i w:val="0"/>
           <w:sz w:val="24"/>
         </w:rPr>
-        <w:t>You tell people to subscribe, and twenty-five thousand have. I followed where that actually leads on your site, and recorded two minutes on it. Different angle from last time — still no pitch.</w:t>
+        <w:t>You tell people to subscribe, and twenty-five thousand have. I followed where that actually leads on your site — it’s the same three minutes I sent last week, different angle on why it matters. Still no pitch.</w:t>
       </w:r>
     </w:p>
     <w:p>
@@ -1111,7 +1111,7 @@
           <w:i w:val="0"/>
           <w:sz w:val="20"/>
         </w:rPr>
-        <w:t>Here’s the number. Sixteen students, total, across both courses, since June of last year. The one course price published on your site is a hundred and ninety-nine dollars — so, roughly three thousand dollars. That’s the lifetime total. One video of yours reaches more people in a day than both courses have enrolled in their life. You’ve said three books are coming this year. This gap is the ceiling on all three — and it doesn’t shrink as you grow, it scales with you.</w:t>
+        <w:t>Here’s the number. Sixteen students, total, across both courses, since June of last year. The one course price published on your site is a hundred and ninety-nine dollars — so, roughly three thousand dollars. That’s the lifetime total. One video of yours gets more views in a day than both courses have enrolled in their life. You’ve said three books are coming this year. This gap is the ceiling on all three — and it doesn’t shrink as you grow, it scales with you.</w:t>
       </w:r>
     </w:p>
     <w:p>
@@ -1125,7 +1125,7 @@
           <w:i w:val="0"/>
           <w:sz w:val="20"/>
         </w:rPr>
-        <w:t>You know the inside of this. I only see the outside. So tell me which one is really the bottleneck — the broken checkout, or the fact that nothing on your channel points to the course. If I’ve read this wrong, say so and I’ll leave it there.</w:t>
+        <w:t>You know the inside of this. I only see the outside. So tell me which one is really the bottleneck — the broken checkout, or the path from your channel to the course. If I’ve read this wrong, say so and I’ll leave it there.</w:t>
       </w:r>
     </w:p>
     <w:p>
@@ -1867,7 +1867,7 @@
           <w:i w:val="0"/>
           <w:sz w:val="24"/>
         </w:rPr>
-        <w:t>🎙 SPEAK  “Here’s the number. Sixteen students, total, across both courses, since June of last year. The one course price published on your site is a hundred and ninety-nine dollars — so, roughly three thousand dollars. That’s the lifetime total. One video of yours reaches more people in a day than both courses have enrolled in their life. You’ve said three books are coming this year. This gap is the ceiling on all three — and it doesn’t shrink as you grow, it scales with you.”</w:t>
+        <w:t>🎙 SPEAK  “Here’s the number. Sixteen students, total, across both courses, since June of last year. The one course price published on your site is a hundred and ninety-nine dollars — so, roughly three thousand dollars. That’s the lifetime total. One video of yours gets more views in a day than both courses have enrolled in their life. You’ve said three books are coming this year. This gap is the ceiling on all three — and it doesn’t shrink as you grow, it scales with you.”</w:t>
       </w:r>
     </w:p>
     <w:p>
@@ -1972,6 +1972,21 @@
           <w:i w:val="0"/>
           <w:sz w:val="22"/>
         </w:rPr>
+        <w:t>📌 NOTE  ⚠ VIEWS ARE NOT PEOPLE. The line says “gets more views in a day,” never “reaches more people.” p1f’s own caveat is explicit: 2,000–3,500 views is not 2,000–3,500 distinct humans, and a meaningful share are returning subscribers. The comparison survives either way — 2,000 views dwarfs 16 enrolments — so there is no reason to take the overstatement. Do not restore “reaches more people.”</w:t>
+      </w:r>
+    </w:p>
+    <w:p>
+      <w:pPr>
+        <w:spacing w:after="80"/>
+        <w:shd w:val="clear" w:color="auto" w:fill="FFF3CC"/>
+      </w:pPr>
+      <w:r>
+        <w:rPr>
+          <w:rFonts w:ascii="Arial" w:hAnsi="Arial" w:eastAsia="Arial"/>
+          <w:b w:val="0"/>
+          <w:i w:val="0"/>
+          <w:sz w:val="22"/>
+        </w:rPr>
         <w:t>📌 NOTE  Tone discipline: pressure the GOAL, never the character. No guilt, no shame, no comparison to a better-run peer.</w:t>
       </w:r>
     </w:p>
@@ -2048,7 +2063,7 @@
           <w:i w:val="0"/>
           <w:sz w:val="24"/>
         </w:rPr>
-        <w:t>🎙 SPEAK  “You know the inside of this. I only see the outside. So tell me which one is really the bottleneck — the broken checkout, or the fact that nothing on your channel points to the course. If I’ve read this wrong, say so and I’ll leave it there.”</w:t>
+        <w:t>🎙 SPEAK  “You know the inside of this. I only see the outside. So tell me which one is really the bottleneck — the broken checkout, or the path from your channel to the course. If I’ve read this wrong, say so and I’ll leave it there.”</w:t>
       </w:r>
     </w:p>
     <w:p>
@@ -2064,6 +2079,21 @@
           <w:sz w:val="22"/>
         </w:rPr>
         <w:t>📌 NOTE  PROOF-OF-COMPETENCE LINE: DELIBERATELY OMITTED. No real, specific, verifiable Dev8X result is present in any attached file — p4a_Business_Operations_Manual.docx.md documents the PROSPECT’s operations, not Dev8X’s. Per THE ONE PROOF OF COMPETENCE, a generic capability sentence (“this is the kind of operational gap we build systems to close”) is worse than silence: it is the one salesman sentence in an otherwise diagnostic piece. At this gate Abdul is selling diagnostic capability, and the preceding two minutes are the proof. If a real, nameable comparable build exists, add ONE sentence here — otherwise leave it out.</w:t>
+      </w:r>
+    </w:p>
+    <w:p>
+      <w:pPr>
+        <w:spacing w:after="80"/>
+        <w:shd w:val="clear" w:color="auto" w:fill="FFF3CC"/>
+      </w:pPr>
+      <w:r>
+        <w:rPr>
+          <w:rFonts w:ascii="Arial" w:hAnsi="Arial" w:eastAsia="Arial"/>
+          <w:b w:val="0"/>
+          <w:i w:val="0"/>
+          <w:sz w:val="22"/>
+        </w:rPr>
+        <w:t>📌 NOTE  ⚠ BEAT 3 / BEAT 5 CONSISTENCY — the reason this line reads “the path from your channel to the course” and NOT “the fact that nothing on your channel points to the course.” Beat 3 confesses “I don’t know whether a single video description has ever pointed at it,” and p0b’s cross-check marks the YouTube-to-course link OPEN and unverified. Asserting in Beat 5 the very thing Beat 3 said it could not see is the same contradiction the Decoupling rule exists to prevent — and it lands in the last sentence of the video, where it is most remembered. The neutral phrasing keeps the forced choice intact without claiming a fact Abdul does not have. Do not tighten it back.</w:t>
       </w:r>
     </w:p>
     <w:p>
@@ -2944,7 +2974,7 @@
           <w:i w:val="0"/>
           <w:sz w:val="21"/>
         </w:rPr>
-        <w:t>Beat 1: 43 · Beat 2: 99 · Beat 3: 85 · Beat 4: 84 · Beat 5: 48 — TOTAL 359 words. Target is 280–360. At a calm ~120 wpm this runs about 3.0 minutes, inside the 2–3 minute bar with room for the mandated pauses.</w:t>
+        <w:t>Beat 1: 43 · Beat 2: 99 · Beat 3: 85 · Beat 4: 84 · Beat 5: 45 — TOTAL 356 words. Target is 280–360. At a calm ~120 wpm this runs about 3.0 minutes, inside the 2–3 minute bar with room for the mandated pauses.</w:t>
       </w:r>
     </w:p>
     <w:p>

</xml_diff>